<commit_message>
Updated full name functions
</commit_message>
<xml_diff>
--- a/docassemble/PersonnelFileRequest/data/templates/Personnel_File_Request_DA_Instructions.docx
+++ b/docassemble/PersonnelFileRequest/data/templates/Personnel_File_Request_DA_Instructions.docx
@@ -184,7 +184,25 @@
           <w:sz w:val="28"/>
           <w:szCs w:val="28"/>
         </w:rPr>
-        <w:t>You made your letter. Here’s what to do next.</w:t>
+        <w:t xml:space="preserve">You </w:t>
+      </w:r>
+      <w:proofErr w:type="gramStart"/>
+      <w:r>
+        <w:rPr>
+          <w:rFonts w:ascii="Muli" w:hAnsi="Muli"/>
+          <w:sz w:val="28"/>
+          <w:szCs w:val="28"/>
+        </w:rPr>
+        <w:t>made</w:t>
+      </w:r>
+      <w:proofErr w:type="gramEnd"/>
+      <w:r>
+        <w:rPr>
+          <w:rFonts w:ascii="Muli" w:hAnsi="Muli"/>
+          <w:sz w:val="28"/>
+          <w:szCs w:val="28"/>
+        </w:rPr>
+        <w:t xml:space="preserve"> your letter. Here’s what to do next.</w:t>
       </w:r>
     </w:p>
     <w:p>
@@ -492,7 +510,25 @@
                 <w:sz w:val="28"/>
                 <w:szCs w:val="28"/>
               </w:rPr>
-              <w:t>gnature, you can skip this step</w:t>
+              <w:t xml:space="preserve">gnature, you </w:t>
+            </w:r>
+            <w:proofErr w:type="gramStart"/>
+            <w:r>
+              <w:rPr>
+                <w:rFonts w:ascii="Muli" w:hAnsi="Muli"/>
+                <w:sz w:val="28"/>
+                <w:szCs w:val="28"/>
+              </w:rPr>
+              <w:t>can</w:t>
+            </w:r>
+            <w:proofErr w:type="gramEnd"/>
+            <w:r>
+              <w:rPr>
+                <w:rFonts w:ascii="Muli" w:hAnsi="Muli"/>
+                <w:sz w:val="28"/>
+                <w:szCs w:val="28"/>
+              </w:rPr>
+              <w:t xml:space="preserve"> skip this step</w:t>
             </w:r>
             <w:r>
               <w:rPr>
@@ -733,15 +769,59 @@
                 <w:sz w:val="28"/>
                 <w:szCs w:val="28"/>
               </w:rPr>
-              <w:t>{{employer</w:t>
-            </w:r>
-            <w:r>
-              <w:rPr>
-                <w:rFonts w:ascii="Muli" w:hAnsi="Muli"/>
-                <w:sz w:val="28"/>
-                <w:szCs w:val="28"/>
-              </w:rPr>
-              <w:t>.name.full(middle='full')</w:t>
+              <w:t>{{</w:t>
+            </w:r>
+            <w:proofErr w:type="spellStart"/>
+            <w:r>
+              <w:rPr>
+                <w:rFonts w:ascii="Muli" w:hAnsi="Muli"/>
+                <w:sz w:val="28"/>
+                <w:szCs w:val="28"/>
+              </w:rPr>
+              <w:t>employer</w:t>
+            </w:r>
+            <w:r>
+              <w:rPr>
+                <w:rFonts w:ascii="Muli" w:hAnsi="Muli"/>
+                <w:sz w:val="28"/>
+                <w:szCs w:val="28"/>
+              </w:rPr>
+              <w:t>.</w:t>
+            </w:r>
+            <w:r>
+              <w:rPr>
+                <w:rFonts w:ascii="Muli" w:hAnsi="Muli"/>
+                <w:sz w:val="28"/>
+                <w:szCs w:val="28"/>
+              </w:rPr>
+              <w:t>name_</w:t>
+            </w:r>
+            <w:proofErr w:type="gramStart"/>
+            <w:r>
+              <w:rPr>
+                <w:rFonts w:ascii="Muli" w:hAnsi="Muli"/>
+                <w:sz w:val="28"/>
+                <w:szCs w:val="28"/>
+              </w:rPr>
+              <w:t>full</w:t>
+            </w:r>
+            <w:proofErr w:type="spellEnd"/>
+            <w:r>
+              <w:rPr>
+                <w:rFonts w:ascii="Muli" w:hAnsi="Muli"/>
+                <w:sz w:val="28"/>
+                <w:szCs w:val="28"/>
+              </w:rPr>
+              <w:t>(</w:t>
+            </w:r>
+            <w:proofErr w:type="gramEnd"/>
+            <w:r>
+              <w:rPr>
+                <w:rFonts w:ascii="Muli" w:hAnsi="Muli"/>
+                <w:sz w:val="28"/>
+                <w:szCs w:val="28"/>
+              </w:rPr>
+              <w:t>)</w:t>
             </w:r>
             <w:r>
               <w:rPr>
@@ -797,15 +877,59 @@
           <w:sz w:val="28"/>
           <w:szCs w:val="28"/>
         </w:rPr>
-        <w:t>{{employer</w:t>
-      </w:r>
-      <w:r>
-        <w:rPr>
-          <w:rFonts w:ascii="Muli" w:hAnsi="Muli"/>
-          <w:sz w:val="28"/>
-          <w:szCs w:val="28"/>
-        </w:rPr>
-        <w:t>.name.full(middle='full')</w:t>
+        <w:t>{{</w:t>
+      </w:r>
+      <w:proofErr w:type="spellStart"/>
+      <w:r>
+        <w:rPr>
+          <w:rFonts w:ascii="Muli" w:hAnsi="Muli"/>
+          <w:sz w:val="28"/>
+          <w:szCs w:val="28"/>
+        </w:rPr>
+        <w:t>employer</w:t>
+      </w:r>
+      <w:r>
+        <w:rPr>
+          <w:rFonts w:ascii="Muli" w:hAnsi="Muli"/>
+          <w:sz w:val="28"/>
+          <w:szCs w:val="28"/>
+        </w:rPr>
+        <w:t>.</w:t>
+      </w:r>
+      <w:r>
+        <w:rPr>
+          <w:rFonts w:ascii="Muli" w:hAnsi="Muli"/>
+          <w:sz w:val="28"/>
+          <w:szCs w:val="28"/>
+        </w:rPr>
+        <w:t>name_</w:t>
+      </w:r>
+      <w:proofErr w:type="gramStart"/>
+      <w:r>
+        <w:rPr>
+          <w:rFonts w:ascii="Muli" w:hAnsi="Muli"/>
+          <w:sz w:val="28"/>
+          <w:szCs w:val="28"/>
+        </w:rPr>
+        <w:t>full</w:t>
+      </w:r>
+      <w:proofErr w:type="spellEnd"/>
+      <w:r>
+        <w:rPr>
+          <w:rFonts w:ascii="Muli" w:hAnsi="Muli"/>
+          <w:sz w:val="28"/>
+          <w:szCs w:val="28"/>
+        </w:rPr>
+        <w:t>(</w:t>
+      </w:r>
+      <w:proofErr w:type="gramEnd"/>
+      <w:r>
+        <w:rPr>
+          <w:rFonts w:ascii="Muli" w:hAnsi="Muli"/>
+          <w:sz w:val="28"/>
+          <w:szCs w:val="28"/>
+        </w:rPr>
+        <w:t>)</w:t>
       </w:r>
       <w:r>
         <w:rPr>
@@ -869,7 +993,25 @@
           <w:sz w:val="28"/>
           <w:szCs w:val="28"/>
         </w:rPr>
-        <w:t>. Find low cost lawyers near you at</w:t>
+        <w:t xml:space="preserve">. Find </w:t>
+      </w:r>
+      <w:proofErr w:type="gramStart"/>
+      <w:r>
+        <w:rPr>
+          <w:rFonts w:ascii="Muli" w:hAnsi="Muli"/>
+          <w:sz w:val="28"/>
+          <w:szCs w:val="28"/>
+        </w:rPr>
+        <w:t>low cost</w:t>
+      </w:r>
+      <w:proofErr w:type="gramEnd"/>
+      <w:r>
+        <w:rPr>
+          <w:rFonts w:ascii="Muli" w:hAnsi="Muli"/>
+          <w:sz w:val="28"/>
+          <w:szCs w:val="28"/>
+        </w:rPr>
+        <w:t xml:space="preserve"> lawyers near you at</w:t>
       </w:r>
       <w:r>
         <w:rPr>
@@ -939,8 +1081,9 @@
           <w:sz w:val="28"/>
           <w:szCs w:val="28"/>
         </w:rPr>
-        <w:t>{{employer</w:t>
-      </w:r>
+        <w:t>{{</w:t>
+      </w:r>
+      <w:proofErr w:type="spellStart"/>
       <w:r>
         <w:rPr>
           <w:rFonts w:ascii="Muli" w:hAnsi="Muli"/>
@@ -949,7 +1092,60 @@
           <w:sz w:val="28"/>
           <w:szCs w:val="28"/>
         </w:rPr>
-        <w:t>.name.full(middle='full')</w:t>
+        <w:t>employer</w:t>
+      </w:r>
+      <w:r>
+        <w:rPr>
+          <w:rFonts w:ascii="Muli" w:hAnsi="Muli"/>
+          <w:b/>
+          <w:bCs/>
+          <w:sz w:val="28"/>
+          <w:szCs w:val="28"/>
+        </w:rPr>
+        <w:t>.</w:t>
+      </w:r>
+      <w:r>
+        <w:rPr>
+          <w:rFonts w:ascii="Muli" w:hAnsi="Muli"/>
+          <w:b/>
+          <w:bCs/>
+          <w:sz w:val="28"/>
+          <w:szCs w:val="28"/>
+        </w:rPr>
+        <w:t>name_</w:t>
+      </w:r>
+      <w:proofErr w:type="gramStart"/>
+      <w:r>
+        <w:rPr>
+          <w:rFonts w:ascii="Muli" w:hAnsi="Muli"/>
+          <w:b/>
+          <w:bCs/>
+          <w:sz w:val="28"/>
+          <w:szCs w:val="28"/>
+        </w:rPr>
+        <w:t>full</w:t>
+      </w:r>
+      <w:proofErr w:type="spellEnd"/>
+      <w:r>
+        <w:rPr>
+          <w:rFonts w:ascii="Muli" w:hAnsi="Muli"/>
+          <w:b/>
+          <w:bCs/>
+          <w:sz w:val="28"/>
+          <w:szCs w:val="28"/>
+        </w:rPr>
+        <w:t>(</w:t>
+      </w:r>
+      <w:proofErr w:type="gramEnd"/>
+      <w:r>
+        <w:rPr>
+          <w:rFonts w:ascii="Muli" w:hAnsi="Muli"/>
+          <w:b/>
+          <w:bCs/>
+          <w:sz w:val="28"/>
+          <w:szCs w:val="28"/>
+        </w:rPr>
+        <w:t>)</w:t>
       </w:r>
       <w:r>
         <w:rPr>

</xml_diff>